<commit_message>
Add ChipLink (venture 6) to demo portfolio and technical white paper
</commit_message>
<xml_diff>
--- a/zeropay-digital-services-ltd/ZEROPAY_DIGITAL_SERVICES_NEW_VENTURES_WHITEPAPER.docx
+++ b/zeropay-digital-services-ltd/ZEROPAY_DIGITAL_SERVICES_NEW_VENTURES_WHITEPAPER.docx
@@ -64,7 +64,7 @@
           <w:sz w:val="40"/>
           <w:szCs w:val="40"/>
         </w:rPr>
-        <w:t xml:space="preserve">AgriLink · CivicTrack · TriageAI · LearnOffline · SafeGuard</w:t>
+        <w:t xml:space="preserve">AgriLink · CivicTrack · TriageAI · LearnOffline · SafeGuard · ChipLink</w:t>
       </w:r>
     </w:p>
     <w:p>
@@ -177,7 +177,7 @@
           <w:sz w:val="36"/>
           <w:szCs w:val="36"/>
         </w:rPr>
-        <w:t xml:space="preserve">Zeropay Digital Services Ltd is a United Kingdom subsidiary of BETONIQ WEST LTD, established to develop and operate five independent software solutions, each targeting a distinct, urgent global problem: food loss in agriculture, corruption and delay in public services, early cancer/disease detection access, offline education access, and fraud/trafficking prevention. All five platforms are engineered independently of any single vendor platform, using GitHub for version control and Hugging Face for AI-model hosting and inference, ensuring long-term technical sovereignty and portability.</w:t>
+        <w:t xml:space="preserve">Zeropay Digital Services Ltd is a United Kingdom subsidiary of BETONIQ WEST LTD, established to develop and operate six independent software solutions, each targeting a distinct, urgent global problem: food loss in agriculture, corruption and delay in public services, early cancer/disease detection access, offline education access, fraud/trafficking prevention, and semiconductor supply-chain concentration. All six platforms are engineered independently of any single vendor platform, using GitHub for version control and Hugging Face for AI-model hosting and inference, ensuring long-term technical sovereignty and portability.</w:t>
       </w:r>
     </w:p>
     <w:p>
@@ -3680,7 +3680,58 @@
           <w:sz w:val="44"/>
           <w:szCs w:val="44"/>
         </w:rPr>
-        <w:t xml:space="preserve">Group Summary &amp; Next Steps</w:t>
+        <w:t xml:space="preserve">6. ChipLink</w:t>
+      </w:r>
+    </w:p>
+    <w:p>
+      <w:pPr>
+        <w:spacing w:after="160"/>
+      </w:pPr>
+      <w:r>
+        <w:rPr>
+          <w:rFonts w:ascii="Arial" w:cs="Arial" w:eastAsia="Arial" w:hAnsi="Arial"/>
+          <w:b w:val="false"/>
+          <w:bCs w:val="false"/>
+          <w:i/>
+          <w:iCs/>
+          <w:sz w:val="36"/>
+          <w:szCs w:val="36"/>
+        </w:rPr>
+        <w:t xml:space="preserve">Fabless mature-node chip sourcing and design brokerage.</w:t>
+      </w:r>
+    </w:p>
+    <w:p>
+      <w:pPr>
+        <w:spacing w:after="160"/>
+      </w:pPr>
+      <w:r>
+        <w:rPr>
+          <w:rFonts w:ascii="Arial" w:cs="Arial" w:eastAsia="Arial" w:hAnsi="Arial"/>
+          <w:b/>
+          <w:bCs/>
+          <w:i w:val="false"/>
+          <w:iCs w:val="false"/>
+          <w:sz w:val="36"/>
+          <w:szCs w:val="36"/>
+        </w:rPr>
+        <w:t xml:space="preserve">Key statistic: A handful of companies control the world's advanced semiconductor supply. Leading-edge fabrication (below 7nm) requires ASML EUV lithography tooling, export-controlled to a small number of countries and costing $10-20 billion+ per fab — but the mature-node tier (28nm and above), which powers most real-world devices including payment terminals, automotive systems, and IoT, remains open to new entrants.</w:t>
+      </w:r>
+    </w:p>
+    <w:p>
+      <w:pPr>
+        <w:pStyle w:val="Heading2"/>
+        <w:spacing w:after="140" w:before="260"/>
+      </w:pPr>
+      <w:r>
+        <w:rPr>
+          <w:rFonts w:ascii="Arial" w:cs="Arial" w:eastAsia="Arial" w:hAnsi="Arial"/>
+          <w:b/>
+          <w:bCs/>
+          <w:color w:val="2E5395"/>
+          <w:sz w:val="40"/>
+          <w:szCs w:val="40"/>
+        </w:rPr>
+        <w:t xml:space="preserve">Problem Statement</w:t>
       </w:r>
     </w:p>
     <w:p>
@@ -3697,7 +3748,602 @@
           <w:sz w:val="36"/>
           <w:szCs w:val="36"/>
         </w:rPr>
-        <w:t xml:space="preserve">All five platforms are structured as independent product lines under Zeropay Digital Services Ltd, the UK subsidiary of BETONIQ WEST LTD. This structure allows each platform to be pitched to its own most relevant funder category — agriculture, GovTech, global health, education, and anti-trafficking/consumer protection — while sharing common engineering standards: GitHub-based version control, Hugging Face-hosted AI inference, offline-first design where relevant, and a consistent commitment to data minimization and privacy by design.</w:t>
+        <w:t xml:space="preserve">Small and mid-sized hardware manufacturers, including African fintech and IoT makers, are frequently locked out of chip supply by minimum-order-quantity thresholds and broker markups, even for mature-node components that do not require cutting-edge fabrication. ChipLink deliberately does not attempt to compete at the leading edge, which is not a realistic or safe target for a company at this stage — instead it targets the large, genuinely accessible mature-node and chip-packaging/testing (OSAT) market.</w:t>
+      </w:r>
+    </w:p>
+    <w:p>
+      <w:pPr>
+        <w:pStyle w:val="Heading2"/>
+        <w:spacing w:after="140" w:before="260"/>
+      </w:pPr>
+      <w:r>
+        <w:rPr>
+          <w:rFonts w:ascii="Arial" w:cs="Arial" w:eastAsia="Arial" w:hAnsi="Arial"/>
+          <w:b/>
+          <w:bCs/>
+          <w:color w:val="2E5395"/>
+          <w:sz w:val="40"/>
+          <w:szCs w:val="40"/>
+        </w:rPr>
+        <w:t xml:space="preserve">Technical Architecture</w:t>
+      </w:r>
+    </w:p>
+    <w:p>
+      <w:pPr>
+        <w:pStyle w:val="ListParagraph"/>
+        <w:numPr>
+          <w:ilvl w:val="0"/>
+          <w:numId w:val="2"/>
+        </w:numPr>
+        <w:spacing w:after="100"/>
+      </w:pPr>
+      <w:r>
+        <w:rPr>
+          <w:rFonts w:ascii="Arial" w:cs="Arial" w:eastAsia="Arial" w:hAnsi="Arial"/>
+          <w:sz w:val="36"/>
+          <w:szCs w:val="36"/>
+        </w:rPr>
+        <w:t xml:space="preserve">RFQ marketplace lets a buyer submit a chip specification and quantity; verified mature-node foundries and OSAT partners bid competitively and transparently.</w:t>
+      </w:r>
+    </w:p>
+    <w:p>
+      <w:pPr>
+        <w:pStyle w:val="ListParagraph"/>
+        <w:numPr>
+          <w:ilvl w:val="0"/>
+          <w:numId w:val="2"/>
+        </w:numPr>
+        <w:spacing w:after="100"/>
+      </w:pPr>
+      <w:r>
+        <w:rPr>
+          <w:rFonts w:ascii="Arial" w:cs="Arial" w:eastAsia="Arial" w:hAnsi="Arial"/>
+          <w:sz w:val="36"/>
+          <w:szCs w:val="36"/>
+        </w:rPr>
+        <w:t xml:space="preserve">Order-pooling engine aggregates volume across multiple small buyers with compatible specifications to collectively reach a foundry's minimum-order-quantity threshold.</w:t>
+      </w:r>
+    </w:p>
+    <w:p>
+      <w:pPr>
+        <w:pStyle w:val="ListParagraph"/>
+        <w:numPr>
+          <w:ilvl w:val="0"/>
+          <w:numId w:val="2"/>
+        </w:numPr>
+        <w:spacing w:after="100"/>
+      </w:pPr>
+      <w:r>
+        <w:rPr>
+          <w:rFonts w:ascii="Arial" w:cs="Arial" w:eastAsia="Arial" w:hAnsi="Arial"/>
+          <w:sz w:val="36"/>
+          <w:szCs w:val="36"/>
+        </w:rPr>
+        <w:t xml:space="preserve">Fabless design-support layer helps a buyer without in-house chip expertise translate a product requirement into a manufacturable specification.</w:t>
+      </w:r>
+    </w:p>
+    <w:p>
+      <w:pPr>
+        <w:pStyle w:val="ListParagraph"/>
+        <w:numPr>
+          <w:ilvl w:val="0"/>
+          <w:numId w:val="2"/>
+        </w:numPr>
+        <w:spacing w:after="100"/>
+      </w:pPr>
+      <w:r>
+        <w:rPr>
+          <w:rFonts w:ascii="Arial" w:cs="Arial" w:eastAsia="Arial" w:hAnsi="Arial"/>
+          <w:sz w:val="36"/>
+          <w:szCs w:val="36"/>
+        </w:rPr>
+        <w:t xml:space="preserve">Explicit scope boundary: ChipLink targets mature-node (28nm and above) sourcing and OSAT packaging/testing only — it does not attempt leading-edge fabrication, which requires export-controlled tooling outside realistic reach.</w:t>
+      </w:r>
+    </w:p>
+    <w:p>
+      <w:pPr>
+        <w:pStyle w:val="Heading2"/>
+        <w:spacing w:after="140" w:before="260"/>
+      </w:pPr>
+      <w:r>
+        <w:rPr>
+          <w:rFonts w:ascii="Arial" w:cs="Arial" w:eastAsia="Arial" w:hAnsi="Arial"/>
+          <w:b/>
+          <w:bCs/>
+          <w:color w:val="2E5395"/>
+          <w:sz w:val="40"/>
+          <w:szCs w:val="40"/>
+        </w:rPr>
+        <w:t xml:space="preserve">Core Data Model</w:t>
+      </w:r>
+    </w:p>
+    <w:tbl>
+      <w:tblPr>
+        <w:tblW w:type="dxa" w:w="9360"/>
+        <w:tblBorders>
+          <w:top w:val="single" w:color="auto" w:sz="4"/>
+          <w:left w:val="single" w:color="auto" w:sz="4"/>
+          <w:bottom w:val="single" w:color="auto" w:sz="4"/>
+          <w:right w:val="single" w:color="auto" w:sz="4"/>
+          <w:insideH w:val="single" w:color="auto" w:sz="4"/>
+          <w:insideV w:val="single" w:color="auto" w:sz="4"/>
+        </w:tblBorders>
+      </w:tblPr>
+      <w:tblGrid>
+        <w:gridCol w:w="3120"/>
+        <w:gridCol w:w="6240"/>
+      </w:tblGrid>
+      <w:tr>
+        <w:tc>
+          <w:tcPr>
+            <w:tcW w:type="dxa" w:w="3120"/>
+            <w:tcBorders>
+              <w:top w:val="single" w:color="CCCCCC" w:sz="1"/>
+              <w:left w:val="single" w:color="CCCCCC" w:sz="1"/>
+              <w:bottom w:val="single" w:color="CCCCCC" w:sz="1"/>
+              <w:right w:val="single" w:color="CCCCCC" w:sz="1"/>
+            </w:tcBorders>
+            <w:shd w:fill="1F3864" w:val="clear"/>
+            <w:tcMar>
+              <w:top w:type="dxa" w:w="100"/>
+              <w:left w:type="dxa" w:w="140"/>
+              <w:bottom w:type="dxa" w:w="100"/>
+              <w:right w:type="dxa" w:w="140"/>
+            </w:tcMar>
+          </w:tcPr>
+          <w:p>
+            <w:r>
+              <w:rPr>
+                <w:rFonts w:ascii="Arial" w:cs="Arial" w:eastAsia="Arial" w:hAnsi="Arial"/>
+                <w:b/>
+                <w:bCs/>
+                <w:color w:val="FFFFFF"/>
+                <w:sz w:val="36"/>
+                <w:szCs w:val="36"/>
+              </w:rPr>
+              <w:t xml:space="preserve">Entity</w:t>
+            </w:r>
+          </w:p>
+        </w:tc>
+        <w:tc>
+          <w:tcPr>
+            <w:tcW w:type="dxa" w:w="6240"/>
+            <w:tcBorders>
+              <w:top w:val="single" w:color="CCCCCC" w:sz="1"/>
+              <w:left w:val="single" w:color="CCCCCC" w:sz="1"/>
+              <w:bottom w:val="single" w:color="CCCCCC" w:sz="1"/>
+              <w:right w:val="single" w:color="CCCCCC" w:sz="1"/>
+            </w:tcBorders>
+            <w:shd w:fill="1F3864" w:val="clear"/>
+            <w:tcMar>
+              <w:top w:type="dxa" w:w="100"/>
+              <w:left w:type="dxa" w:w="140"/>
+              <w:bottom w:type="dxa" w:w="100"/>
+              <w:right w:type="dxa" w:w="140"/>
+            </w:tcMar>
+          </w:tcPr>
+          <w:p>
+            <w:r>
+              <w:rPr>
+                <w:rFonts w:ascii="Arial" w:cs="Arial" w:eastAsia="Arial" w:hAnsi="Arial"/>
+                <w:b/>
+                <w:bCs/>
+                <w:color w:val="FFFFFF"/>
+                <w:sz w:val="36"/>
+                <w:szCs w:val="36"/>
+              </w:rPr>
+              <w:t xml:space="preserve">Purpose</w:t>
+            </w:r>
+          </w:p>
+        </w:tc>
+      </w:tr>
+      <w:tr>
+        <w:tc>
+          <w:tcPr>
+            <w:tcW w:type="dxa" w:w="3120"/>
+            <w:tcBorders>
+              <w:top w:val="single" w:color="CCCCCC" w:sz="1"/>
+              <w:left w:val="single" w:color="CCCCCC" w:sz="1"/>
+              <w:bottom w:val="single" w:color="CCCCCC" w:sz="1"/>
+              <w:right w:val="single" w:color="CCCCCC" w:sz="1"/>
+            </w:tcBorders>
+            <w:shd w:fill="EAF1FB" w:val="clear"/>
+            <w:tcMar>
+              <w:top w:type="dxa" w:w="100"/>
+              <w:left w:type="dxa" w:w="140"/>
+              <w:bottom w:type="dxa" w:w="100"/>
+              <w:right w:type="dxa" w:w="140"/>
+            </w:tcMar>
+          </w:tcPr>
+          <w:p>
+            <w:r>
+              <w:rPr>
+                <w:rFonts w:ascii="Arial" w:cs="Arial" w:eastAsia="Arial" w:hAnsi="Arial"/>
+                <w:b/>
+                <w:bCs/>
+                <w:color w:val="1F3864"/>
+                <w:sz w:val="36"/>
+                <w:szCs w:val="36"/>
+              </w:rPr>
+              <w:t xml:space="preserve">Buyer</w:t>
+            </w:r>
+          </w:p>
+        </w:tc>
+        <w:tc>
+          <w:tcPr>
+            <w:tcW w:type="dxa" w:w="6240"/>
+            <w:tcBorders>
+              <w:top w:val="single" w:color="CCCCCC" w:sz="1"/>
+              <w:left w:val="single" w:color="CCCCCC" w:sz="1"/>
+              <w:bottom w:val="single" w:color="CCCCCC" w:sz="1"/>
+              <w:right w:val="single" w:color="CCCCCC" w:sz="1"/>
+            </w:tcBorders>
+            <w:shd w:fill="FFFFFF" w:val="clear"/>
+            <w:tcMar>
+              <w:top w:type="dxa" w:w="100"/>
+              <w:left w:type="dxa" w:w="140"/>
+              <w:bottom w:type="dxa" w:w="100"/>
+              <w:right w:type="dxa" w:w="140"/>
+            </w:tcMar>
+          </w:tcPr>
+          <w:p>
+            <w:r>
+              <w:rPr>
+                <w:rFonts w:ascii="Arial" w:cs="Arial" w:eastAsia="Arial" w:hAnsi="Arial"/>
+                <w:b w:val="false"/>
+                <w:bCs w:val="false"/>
+                <w:color w:val="000000"/>
+                <w:sz w:val="36"/>
+                <w:szCs w:val="36"/>
+              </w:rPr>
+              <w:t xml:space="preserve">Hardware manufacturer submitting a chip specification and required volume.</w:t>
+            </w:r>
+          </w:p>
+        </w:tc>
+      </w:tr>
+      <w:tr>
+        <w:tc>
+          <w:tcPr>
+            <w:tcW w:type="dxa" w:w="3120"/>
+            <w:tcBorders>
+              <w:top w:val="single" w:color="CCCCCC" w:sz="1"/>
+              <w:left w:val="single" w:color="CCCCCC" w:sz="1"/>
+              <w:bottom w:val="single" w:color="CCCCCC" w:sz="1"/>
+              <w:right w:val="single" w:color="CCCCCC" w:sz="1"/>
+            </w:tcBorders>
+            <w:shd w:fill="EAF1FB" w:val="clear"/>
+            <w:tcMar>
+              <w:top w:type="dxa" w:w="100"/>
+              <w:left w:type="dxa" w:w="140"/>
+              <w:bottom w:type="dxa" w:w="100"/>
+              <w:right w:type="dxa" w:w="140"/>
+            </w:tcMar>
+          </w:tcPr>
+          <w:p>
+            <w:r>
+              <w:rPr>
+                <w:rFonts w:ascii="Arial" w:cs="Arial" w:eastAsia="Arial" w:hAnsi="Arial"/>
+                <w:b/>
+                <w:bCs/>
+                <w:color w:val="1F3864"/>
+                <w:sz w:val="36"/>
+                <w:szCs w:val="36"/>
+              </w:rPr>
+              <w:t xml:space="preserve">ChipSpec</w:t>
+            </w:r>
+          </w:p>
+        </w:tc>
+        <w:tc>
+          <w:tcPr>
+            <w:tcW w:type="dxa" w:w="6240"/>
+            <w:tcBorders>
+              <w:top w:val="single" w:color="CCCCCC" w:sz="1"/>
+              <w:left w:val="single" w:color="CCCCCC" w:sz="1"/>
+              <w:bottom w:val="single" w:color="CCCCCC" w:sz="1"/>
+              <w:right w:val="single" w:color="CCCCCC" w:sz="1"/>
+            </w:tcBorders>
+            <w:shd w:fill="FFFFFF" w:val="clear"/>
+            <w:tcMar>
+              <w:top w:type="dxa" w:w="100"/>
+              <w:left w:type="dxa" w:w="140"/>
+              <w:bottom w:type="dxa" w:w="100"/>
+              <w:right w:type="dxa" w:w="140"/>
+            </w:tcMar>
+          </w:tcPr>
+          <w:p>
+            <w:r>
+              <w:rPr>
+                <w:rFonts w:ascii="Arial" w:cs="Arial" w:eastAsia="Arial" w:hAnsi="Arial"/>
+                <w:b w:val="false"/>
+                <w:bCs w:val="false"/>
+                <w:color w:val="000000"/>
+                <w:sz w:val="36"/>
+                <w:szCs w:val="36"/>
+              </w:rPr>
+              <w:t xml:space="preserve">Technical specification: process node, package type, functional requirements.</w:t>
+            </w:r>
+          </w:p>
+        </w:tc>
+      </w:tr>
+      <w:tr>
+        <w:tc>
+          <w:tcPr>
+            <w:tcW w:type="dxa" w:w="3120"/>
+            <w:tcBorders>
+              <w:top w:val="single" w:color="CCCCCC" w:sz="1"/>
+              <w:left w:val="single" w:color="CCCCCC" w:sz="1"/>
+              <w:bottom w:val="single" w:color="CCCCCC" w:sz="1"/>
+              <w:right w:val="single" w:color="CCCCCC" w:sz="1"/>
+            </w:tcBorders>
+            <w:shd w:fill="EAF1FB" w:val="clear"/>
+            <w:tcMar>
+              <w:top w:type="dxa" w:w="100"/>
+              <w:left w:type="dxa" w:w="140"/>
+              <w:bottom w:type="dxa" w:w="100"/>
+              <w:right w:type="dxa" w:w="140"/>
+            </w:tcMar>
+          </w:tcPr>
+          <w:p>
+            <w:r>
+              <w:rPr>
+                <w:rFonts w:ascii="Arial" w:cs="Arial" w:eastAsia="Arial" w:hAnsi="Arial"/>
+                <w:b/>
+                <w:bCs/>
+                <w:color w:val="1F3864"/>
+                <w:sz w:val="36"/>
+                <w:szCs w:val="36"/>
+              </w:rPr>
+              <w:t xml:space="preserve">FoundryPartner</w:t>
+            </w:r>
+          </w:p>
+        </w:tc>
+        <w:tc>
+          <w:tcPr>
+            <w:tcW w:type="dxa" w:w="6240"/>
+            <w:tcBorders>
+              <w:top w:val="single" w:color="CCCCCC" w:sz="1"/>
+              <w:left w:val="single" w:color="CCCCCC" w:sz="1"/>
+              <w:bottom w:val="single" w:color="CCCCCC" w:sz="1"/>
+              <w:right w:val="single" w:color="CCCCCC" w:sz="1"/>
+            </w:tcBorders>
+            <w:shd w:fill="FFFFFF" w:val="clear"/>
+            <w:tcMar>
+              <w:top w:type="dxa" w:w="100"/>
+              <w:left w:type="dxa" w:w="140"/>
+              <w:bottom w:type="dxa" w:w="100"/>
+              <w:right w:type="dxa" w:w="140"/>
+            </w:tcMar>
+          </w:tcPr>
+          <w:p>
+            <w:r>
+              <w:rPr>
+                <w:rFonts w:ascii="Arial" w:cs="Arial" w:eastAsia="Arial" w:hAnsi="Arial"/>
+                <w:b w:val="false"/>
+                <w:bCs w:val="false"/>
+                <w:color w:val="000000"/>
+                <w:sz w:val="36"/>
+                <w:szCs w:val="36"/>
+              </w:rPr>
+              <w:t xml:space="preserve">Verified mature-node foundry or OSAT partner, capacity and lead time.</w:t>
+            </w:r>
+          </w:p>
+        </w:tc>
+      </w:tr>
+      <w:tr>
+        <w:tc>
+          <w:tcPr>
+            <w:tcW w:type="dxa" w:w="3120"/>
+            <w:tcBorders>
+              <w:top w:val="single" w:color="CCCCCC" w:sz="1"/>
+              <w:left w:val="single" w:color="CCCCCC" w:sz="1"/>
+              <w:bottom w:val="single" w:color="CCCCCC" w:sz="1"/>
+              <w:right w:val="single" w:color="CCCCCC" w:sz="1"/>
+            </w:tcBorders>
+            <w:shd w:fill="EAF1FB" w:val="clear"/>
+            <w:tcMar>
+              <w:top w:type="dxa" w:w="100"/>
+              <w:left w:type="dxa" w:w="140"/>
+              <w:bottom w:type="dxa" w:w="100"/>
+              <w:right w:type="dxa" w:w="140"/>
+            </w:tcMar>
+          </w:tcPr>
+          <w:p>
+            <w:r>
+              <w:rPr>
+                <w:rFonts w:ascii="Arial" w:cs="Arial" w:eastAsia="Arial" w:hAnsi="Arial"/>
+                <w:b/>
+                <w:bCs/>
+                <w:color w:val="1F3864"/>
+                <w:sz w:val="36"/>
+                <w:szCs w:val="36"/>
+              </w:rPr>
+              <w:t xml:space="preserve">RFQ</w:t>
+            </w:r>
+          </w:p>
+        </w:tc>
+        <w:tc>
+          <w:tcPr>
+            <w:tcW w:type="dxa" w:w="6240"/>
+            <w:tcBorders>
+              <w:top w:val="single" w:color="CCCCCC" w:sz="1"/>
+              <w:left w:val="single" w:color="CCCCCC" w:sz="1"/>
+              <w:bottom w:val="single" w:color="CCCCCC" w:sz="1"/>
+              <w:right w:val="single" w:color="CCCCCC" w:sz="1"/>
+            </w:tcBorders>
+            <w:shd w:fill="FFFFFF" w:val="clear"/>
+            <w:tcMar>
+              <w:top w:type="dxa" w:w="100"/>
+              <w:left w:type="dxa" w:w="140"/>
+              <w:bottom w:type="dxa" w:w="100"/>
+              <w:right w:type="dxa" w:w="140"/>
+            </w:tcMar>
+          </w:tcPr>
+          <w:p>
+            <w:r>
+              <w:rPr>
+                <w:rFonts w:ascii="Arial" w:cs="Arial" w:eastAsia="Arial" w:hAnsi="Arial"/>
+                <w:b w:val="false"/>
+                <w:bCs w:val="false"/>
+                <w:color w:val="000000"/>
+                <w:sz w:val="36"/>
+                <w:szCs w:val="36"/>
+              </w:rPr>
+              <w:t xml:space="preserve">Request-for-quote record with competing bids from foundry partners.</w:t>
+            </w:r>
+          </w:p>
+        </w:tc>
+      </w:tr>
+      <w:tr>
+        <w:tc>
+          <w:tcPr>
+            <w:tcW w:type="dxa" w:w="3120"/>
+            <w:tcBorders>
+              <w:top w:val="single" w:color="CCCCCC" w:sz="1"/>
+              <w:left w:val="single" w:color="CCCCCC" w:sz="1"/>
+              <w:bottom w:val="single" w:color="CCCCCC" w:sz="1"/>
+              <w:right w:val="single" w:color="CCCCCC" w:sz="1"/>
+            </w:tcBorders>
+            <w:shd w:fill="EAF1FB" w:val="clear"/>
+            <w:tcMar>
+              <w:top w:type="dxa" w:w="100"/>
+              <w:left w:type="dxa" w:w="140"/>
+              <w:bottom w:type="dxa" w:w="100"/>
+              <w:right w:type="dxa" w:w="140"/>
+            </w:tcMar>
+          </w:tcPr>
+          <w:p>
+            <w:r>
+              <w:rPr>
+                <w:rFonts w:ascii="Arial" w:cs="Arial" w:eastAsia="Arial" w:hAnsi="Arial"/>
+                <w:b/>
+                <w:bCs/>
+                <w:color w:val="1F3864"/>
+                <w:sz w:val="36"/>
+                <w:szCs w:val="36"/>
+              </w:rPr>
+              <w:t xml:space="preserve">OrderPool</w:t>
+            </w:r>
+          </w:p>
+        </w:tc>
+        <w:tc>
+          <w:tcPr>
+            <w:tcW w:type="dxa" w:w="6240"/>
+            <w:tcBorders>
+              <w:top w:val="single" w:color="CCCCCC" w:sz="1"/>
+              <w:left w:val="single" w:color="CCCCCC" w:sz="1"/>
+              <w:bottom w:val="single" w:color="CCCCCC" w:sz="1"/>
+              <w:right w:val="single" w:color="CCCCCC" w:sz="1"/>
+            </w:tcBorders>
+            <w:shd w:fill="FFFFFF" w:val="clear"/>
+            <w:tcMar>
+              <w:top w:type="dxa" w:w="100"/>
+              <w:left w:type="dxa" w:w="140"/>
+              <w:bottom w:type="dxa" w:w="100"/>
+              <w:right w:type="dxa" w:w="140"/>
+            </w:tcMar>
+          </w:tcPr>
+          <w:p>
+            <w:r>
+              <w:rPr>
+                <w:rFonts w:ascii="Arial" w:cs="Arial" w:eastAsia="Arial" w:hAnsi="Arial"/>
+                <w:b w:val="false"/>
+                <w:bCs w:val="false"/>
+                <w:color w:val="000000"/>
+                <w:sz w:val="36"/>
+                <w:szCs w:val="36"/>
+              </w:rPr>
+              <w:t xml:space="preserve">Aggregated volume from multiple buyers pooled to reach a foundry's minimum order quantity.</w:t>
+            </w:r>
+          </w:p>
+        </w:tc>
+      </w:tr>
+    </w:tbl>
+    <w:p>
+      <w:pPr>
+        <w:pStyle w:val="Heading2"/>
+        <w:spacing w:after="140" w:before="260"/>
+      </w:pPr>
+      <w:r>
+        <w:rPr>
+          <w:rFonts w:ascii="Arial" w:cs="Arial" w:eastAsia="Arial" w:hAnsi="Arial"/>
+          <w:b/>
+          <w:bCs/>
+          <w:color w:val="2E5395"/>
+          <w:sz w:val="40"/>
+          <w:szCs w:val="40"/>
+        </w:rPr>
+        <w:t xml:space="preserve">Security, Privacy &amp; Compliance</w:t>
+      </w:r>
+    </w:p>
+    <w:p>
+      <w:pPr>
+        <w:pStyle w:val="ListParagraph"/>
+        <w:numPr>
+          <w:ilvl w:val="0"/>
+          <w:numId w:val="2"/>
+        </w:numPr>
+        <w:spacing w:after="100"/>
+      </w:pPr>
+      <w:r>
+        <w:rPr>
+          <w:rFonts w:ascii="Arial" w:cs="Arial" w:eastAsia="Arial" w:hAnsi="Arial"/>
+          <w:sz w:val="36"/>
+          <w:szCs w:val="36"/>
+        </w:rPr>
+        <w:t xml:space="preserve">Buyer chip specifications treated as confidential; visible only to bidding foundry partners under a standard non-disclosure framework.</w:t>
+      </w:r>
+    </w:p>
+    <w:p>
+      <w:pPr>
+        <w:pStyle w:val="ListParagraph"/>
+        <w:numPr>
+          <w:ilvl w:val="0"/>
+          <w:numId w:val="2"/>
+        </w:numPr>
+        <w:spacing w:after="100"/>
+      </w:pPr>
+      <w:r>
+        <w:rPr>
+          <w:rFonts w:ascii="Arial" w:cs="Arial" w:eastAsia="Arial" w:hAnsi="Arial"/>
+          <w:sz w:val="36"/>
+          <w:szCs w:val="36"/>
+        </w:rPr>
+        <w:t xml:space="preserve">Foundry partner verification process to guard against counterfeit or non-compliant component sourcing.</w:t>
+      </w:r>
+    </w:p>
+    <w:p>
+      <w:pPr>
+        <w:pStyle w:val="ListParagraph"/>
+        <w:numPr>
+          <w:ilvl w:val="0"/>
+          <w:numId w:val="2"/>
+        </w:numPr>
+        <w:spacing w:after="100"/>
+      </w:pPr>
+      <w:r>
+        <w:rPr>
+          <w:rFonts w:ascii="Arial" w:cs="Arial" w:eastAsia="Arial" w:hAnsi="Arial"/>
+          <w:sz w:val="36"/>
+          <w:szCs w:val="36"/>
+        </w:rPr>
+        <w:t xml:space="preserve">Order-pooling logic ensures no single pooled buyer can see another pooled buyer's full specification or pricing terms.</w:t>
+      </w:r>
+    </w:p>
+    <w:p>
+      <w:pPr>
+        <w:pStyle w:val="Heading2"/>
+        <w:spacing w:after="140" w:before="260"/>
+      </w:pPr>
+      <w:r>
+        <w:rPr>
+          <w:rFonts w:ascii="Arial" w:cs="Arial" w:eastAsia="Arial" w:hAnsi="Arial"/>
+          <w:b/>
+          <w:bCs/>
+          <w:color w:val="2E5395"/>
+          <w:sz w:val="40"/>
+          <w:szCs w:val="40"/>
+        </w:rPr>
+        <w:t xml:space="preserve">Feasibility &amp; Build Status</w:t>
       </w:r>
     </w:p>
     <w:p>
@@ -3714,7 +4360,93 @@
           <w:sz w:val="36"/>
           <w:szCs w:val="36"/>
         </w:rPr>
-        <w:t xml:space="preserve">Immediate next steps: finalize Hugging Face deployment access; complete first working prototypes in build order (AgriLink, CivicTrack, TriageAI, LearnOffline, SafeGuard); and submit the first wave of grant applications referencing this white paper as supporting technical documentation.</w:t>
+        <w:t xml:space="preserve">RFQ marketplace and order-pooling logic specified. Independent build on GitHub; buyer-foundry matching/ranking logic targeted for Hugging Face hosting. This platform also directly serves Zeropay/BETONIQ WEST's own hardware supply chain need for PUF/ECC secure element components.</w:t>
+      </w:r>
+    </w:p>
+    <w:p>
+      <w:pPr>
+        <w:pStyle w:val="Heading2"/>
+        <w:spacing w:after="140" w:before="260"/>
+      </w:pPr>
+      <w:r>
+        <w:rPr>
+          <w:rFonts w:ascii="Arial" w:cs="Arial" w:eastAsia="Arial" w:hAnsi="Arial"/>
+          <w:b/>
+          <w:bCs/>
+          <w:color w:val="2E5395"/>
+          <w:sz w:val="40"/>
+          <w:szCs w:val="40"/>
+        </w:rPr>
+        <w:t xml:space="preserve">Grant &amp; Funder Fit</w:t>
+      </w:r>
+    </w:p>
+    <w:p>
+      <w:pPr>
+        <w:spacing w:after="160"/>
+      </w:pPr>
+      <w:r>
+        <w:rPr>
+          <w:rFonts w:ascii="Arial" w:cs="Arial" w:eastAsia="Arial" w:hAnsi="Arial"/>
+          <w:b w:val="false"/>
+          <w:bCs w:val="false"/>
+          <w:i w:val="false"/>
+          <w:iCs w:val="false"/>
+          <w:sz w:val="36"/>
+          <w:szCs w:val="36"/>
+        </w:rPr>
+        <w:t xml:space="preserve">Fits industrial policy and supply-chain resilience funding: US CHIPS Act adjacent programs, EU Chips Act supply-chain diversification funds, India Semicon Mission, and African Union/AfDB regional value-chain development grants — a distinct funder pool from the other five platforms.</w:t>
+      </w:r>
+    </w:p>
+    <w:p>
+      <w:pPr>
+        <w:pStyle w:val="Heading1"/>
+        <w:pageBreakBefore/>
+        <w:spacing w:after="200" w:before="100"/>
+      </w:pPr>
+      <w:r>
+        <w:rPr>
+          <w:rFonts w:ascii="Arial" w:cs="Arial" w:eastAsia="Arial" w:hAnsi="Arial"/>
+          <w:b/>
+          <w:bCs/>
+          <w:color w:val="1F3864"/>
+          <w:sz w:val="44"/>
+          <w:szCs w:val="44"/>
+        </w:rPr>
+        <w:t xml:space="preserve">Group Summary &amp; Next Steps</w:t>
+      </w:r>
+    </w:p>
+    <w:p>
+      <w:pPr>
+        <w:spacing w:after="160"/>
+      </w:pPr>
+      <w:r>
+        <w:rPr>
+          <w:rFonts w:ascii="Arial" w:cs="Arial" w:eastAsia="Arial" w:hAnsi="Arial"/>
+          <w:b w:val="false"/>
+          <w:bCs w:val="false"/>
+          <w:i w:val="false"/>
+          <w:iCs w:val="false"/>
+          <w:sz w:val="36"/>
+          <w:szCs w:val="36"/>
+        </w:rPr>
+        <w:t xml:space="preserve">All six platforms are structured as independent product lines under Zeropay Digital Services Ltd, the UK subsidiary of BETONIQ WEST LTD. This structure allows each platform to be pitched to its own most relevant funder category — agriculture, GovTech, global health, education, anti-trafficking/consumer protection, and semiconductor supply-chain resilience — while sharing common engineering standards: GitHub-based version control, Hugging Face-hosted AI inference, offline-first design where relevant, and a consistent commitment to data minimization and privacy by design.</w:t>
+      </w:r>
+    </w:p>
+    <w:p>
+      <w:pPr>
+        <w:spacing w:after="160"/>
+      </w:pPr>
+      <w:r>
+        <w:rPr>
+          <w:rFonts w:ascii="Arial" w:cs="Arial" w:eastAsia="Arial" w:hAnsi="Arial"/>
+          <w:b w:val="false"/>
+          <w:bCs w:val="false"/>
+          <w:i w:val="false"/>
+          <w:iCs w:val="false"/>
+          <w:sz w:val="36"/>
+          <w:szCs w:val="36"/>
+        </w:rPr>
+        <w:t xml:space="preserve">Immediate next steps: finalize Hugging Face deployment access; complete first working prototypes in build order (AgriLink, CivicTrack, TriageAI, LearnOffline, SafeGuard, ChipLink); and submit the first wave of grant applications referencing this white paper as supporting technical documentation.</w:t>
       </w:r>
     </w:p>
     <w:sectPr>

</xml_diff>